<commit_message>
Replace OSPA naming with Office of Research Aid
All docs, UI roles, HITL config, diagrams, and filenames now use
Office of Research Aid as the institutional submitting office.
</commit_message>
<xml_diff>
--- a/ui-copilotkit/public/review-report.docx
+++ b/ui-copilotkit/public/review-report.docx
@@ -28,7 +28,7 @@
         <w:t xml:space="preserve">Readiness: </w:t>
       </w:r>
       <w:r>
-        <w:t>46 / 100</w:t>
+        <w:t>33 / 100</w:t>
         <w:br/>
       </w:r>
       <w:r>
@@ -38,7 +38,7 @@
         <w:t xml:space="preserve">Summary: </w:t>
       </w:r>
       <w:r>
-        <w:t>4 finding(s): 1 blocker/fatal, 2 major. Not ready to freeze for OSPA.</w:t>
+        <w:t>4 finding(s): 1 blocker/fatal, 2 major. 5/15 required items present. Missing: AIMS_INDEPENDENT, SIGNIFICANCE, INNOVATION, BIBLIOGRAPHY, PI_EFFORT, BIOSKETCH_PI, OTHER_SUPPORT, FACILITIES, DMS_PLAN, HS_VA_DETERMINATION.</w:t>
       </w:r>
     </w:p>
     <w:p>

</xml_diff>

<commit_message>
Replace NIH submit with Office of Research Aid intake
Agent-filled grouped intake form (compliance, formatting,
institutional), human overrides, packaging agent upload to the
office database, and tracking number back to the PI.
</commit_message>
<xml_diff>
--- a/ui-copilotkit/public/review-report.docx
+++ b/ui-copilotkit/public/review-report.docx
@@ -38,12 +38,12 @@
         <w:t xml:space="preserve">Summary: </w:t>
       </w:r>
       <w:r>
-        <w:t>4 finding(s): 1 blocker/fatal, 2 major. 5/15 required items present. Missing: AIMS_INDEPENDENT, SIGNIFICANCE, INNOVATION, BIBLIOGRAPHY, PI_EFFORT, BIOSKETCH_PI, OTHER_SUPPORT, FACILITIES, DMS_PLAN, HS_VA_DETERMINATION.</w:t>
+        <w:t>4 finding(s): 1 blocker/fatal, 2 major. 5/15 required items present. Missing: AIMS_INDEPENDENT, SIGNIFICANCE, INNOVATION, BIBLIOGRAPHY, PI_EFFORT, BIOSKETCH_PI, OTHER_SUPPORT, FACILITIES, DMS_PLAN, HS_VA_DETERMINATION. 13/18 required intake items answered. Still needed: Compliance, Formatting, Institutional, FONT_MARGINS, PI_CERTIFY.</w:t>
       </w:r>
     </w:p>
     <w:p>
       <w:r>
-        <w:t>RBAC: PI can run review and freeze science. Official submit stays with OSPA / AOR. This report is evidence for institutional routing, not an eRA submission.</w:t>
+        <w:t>RBAC: PI reviews, completes the Office of Research Aid intake form, and submits the package to the office database. This is not an NIH ASSIST / Grants.gov submission.</w:t>
       </w:r>
     </w:p>
     <w:p>

</xml_diff>